<commit_message>
Add visualization screenshots to write-up
</commit_message>
<xml_diff>
--- a/layer10_writeup.docx
+++ b/layer10_writeup.docx
@@ -4972,6 +4972,65 @@
     </w:p>
     <w:p>
       <w:pPr>
+        <w:spacing w:before="160" w:after="80"/>
+      </w:pPr>
+      <w:r>
+        <w:rPr/>
+        <w:drawing>
+          <wp:inline xmlns:wp="http://schemas.openxmlformats.org/drawingml/2006/wordprocessingDrawing" distT="0" distB="0" distL="0" distR="0">
+            <wp:extent cx="5943600" cy="2765514"/>
+            <wp:effectExtent l="0" t="0" r="0" b="0"/>
+            <wp:docPr id="1" name="Figure1" descr="Interactive memory graph"/>
+            <wp:cNvGraphicFramePr>
+              <a:graphicFrameLocks xmlns:a="http://schemas.openxmlformats.org/drawingml/2006/main" noChangeAspect="1"/>
+            </wp:cNvGraphicFramePr>
+            <a:graphic xmlns:a="http://schemas.openxmlformats.org/drawingml/2006/main">
+              <a:graphicData uri="http://schemas.openxmlformats.org/drawingml/2006/picture">
+                <pic:pic xmlns:pic="http://schemas.openxmlformats.org/drawingml/2006/picture">
+                  <pic:nvPicPr>
+                    <pic:cNvPr id="1" name="Figure1"/>
+                    <pic:cNvPicPr/>
+                  </pic:nvPicPr>
+                  <pic:blipFill>
+                    <a:blip xmlns:r="http://schemas.openxmlformats.org/officeDocument/2006/relationships" r:embed="rId7"/>
+                    <a:stretch>
+                      <a:fillRect/>
+                    </a:stretch>
+                  </pic:blipFill>
+                  <pic:spPr>
+                    <a:xfrm>
+                      <a:off x="0" y="0"/>
+                      <a:ext cx="5943600" cy="2765514"/>
+                    </a:xfrm>
+                    <a:prstGeom prst="rect">
+                      <a:avLst/>
+                    </a:prstGeom>
+                  </pic:spPr>
+                </pic:pic>
+              </a:graphicData>
+            </a:graphic>
+          </wp:inline>
+        </w:drawing>
+      </w:r>
+    </w:p>
+    <w:p>
+      <w:pPr>
+        <w:spacing w:before="40" w:after="200"/>
+      </w:pPr>
+      <w:r>
+        <w:rPr>
+          <w:rFonts w:ascii="Arial" w:cs="Arial" w:hAnsi="Arial"/>
+          <w:i/>
+          <w:iCs/>
+          <w:color w:val="666666"/>
+          <w:sz w:val="20"/>
+          <w:szCs w:val="20"/>
+        </w:rPr>
+        <w:t xml:space="preserve">Figure 1: Interactive memory graph — 1,636 nodes (persons, components, issues) and 698 edges. Hover nodes/edges for details. Drag to explore, scroll to zoom.</w:t>
+      </w:r>
+    </w:p>
+    <w:p>
+      <w:pPr>
         <w:pStyle w:val="Heading2"/>
         <w:spacing w:before="240" w:after="120"/>
       </w:pPr>
@@ -5107,6 +5166,124 @@
           <w:szCs w:val="22"/>
         </w:rPr>
         <w:t xml:space="preserve">Conflicts &amp; Revisions tab shows 50 state reversals and assignment changes with full history timelines.</w:t>
+      </w:r>
+    </w:p>
+    <w:p>
+      <w:pPr>
+        <w:spacing w:before="160" w:after="80"/>
+      </w:pPr>
+      <w:r>
+        <w:rPr/>
+        <w:drawing>
+          <wp:inline xmlns:wp="http://schemas.openxmlformats.org/drawingml/2006/wordprocessingDrawing" distT="0" distB="0" distL="0" distR="0">
+            <wp:extent cx="5943600" cy="2689736"/>
+            <wp:effectExtent l="0" t="0" r="0" b="0"/>
+            <wp:docPr id="2" name="Figure2" descr="Evidence panel full view"/>
+            <wp:cNvGraphicFramePr>
+              <a:graphicFrameLocks xmlns:a="http://schemas.openxmlformats.org/drawingml/2006/main" noChangeAspect="1"/>
+            </wp:cNvGraphicFramePr>
+            <a:graphic xmlns:a="http://schemas.openxmlformats.org/drawingml/2006/main">
+              <a:graphicData uri="http://schemas.openxmlformats.org/drawingml/2006/picture">
+                <pic:pic xmlns:pic="http://schemas.openxmlformats.org/drawingml/2006/picture">
+                  <pic:nvPicPr>
+                    <pic:cNvPr id="2" name="Figure2"/>
+                    <pic:cNvPicPr/>
+                  </pic:nvPicPr>
+                  <pic:blipFill>
+                    <a:blip xmlns:r="http://schemas.openxmlformats.org/officeDocument/2006/relationships" r:embed="rId8"/>
+                    <a:stretch>
+                      <a:fillRect/>
+                    </a:stretch>
+                  </pic:blipFill>
+                  <pic:spPr>
+                    <a:xfrm>
+                      <a:off x="0" y="0"/>
+                      <a:ext cx="5943600" cy="2689736"/>
+                    </a:xfrm>
+                    <a:prstGeom prst="rect">
+                      <a:avLst/>
+                    </a:prstGeom>
+                  </pic:spPr>
+                </pic:pic>
+              </a:graphicData>
+            </a:graphic>
+          </wp:inline>
+        </w:drawing>
+      </w:r>
+    </w:p>
+    <w:p>
+      <w:pPr>
+        <w:spacing w:before="40" w:after="200"/>
+      </w:pPr>
+      <w:r>
+        <w:rPr>
+          <w:rFonts w:ascii="Arial" w:cs="Arial" w:hAnsi="Arial"/>
+          <w:i/>
+          <w:iCs/>
+          <w:color w:val="666666"/>
+          <w:sz w:val="20"/>
+          <w:szCs w:val="20"/>
+        </w:rPr>
+        <w:t xml:space="preserve">Figure 2: Evidence panel — 300 grounded claims with exact excerpts, confidence scores, source metadata, and View on GitHub links.</w:t>
+      </w:r>
+    </w:p>
+    <w:p>
+      <w:pPr>
+        <w:spacing w:before="160" w:after="80"/>
+      </w:pPr>
+      <w:r>
+        <w:rPr/>
+        <w:drawing>
+          <wp:inline xmlns:wp="http://schemas.openxmlformats.org/drawingml/2006/wordprocessingDrawing" distT="0" distB="0" distL="0" distR="0">
+            <wp:extent cx="5943600" cy="2709582"/>
+            <wp:effectExtent l="0" t="0" r="0" b="0"/>
+            <wp:docPr id="3" name="Figure3" descr="Evidence panel search routing"/>
+            <wp:cNvGraphicFramePr>
+              <a:graphicFrameLocks xmlns:a="http://schemas.openxmlformats.org/drawingml/2006/main" noChangeAspect="1"/>
+            </wp:cNvGraphicFramePr>
+            <a:graphic xmlns:a="http://schemas.openxmlformats.org/drawingml/2006/main">
+              <a:graphicData uri="http://schemas.openxmlformats.org/drawingml/2006/picture">
+                <pic:pic xmlns:pic="http://schemas.openxmlformats.org/drawingml/2006/picture">
+                  <pic:nvPicPr>
+                    <pic:cNvPr id="3" name="Figure3"/>
+                    <pic:cNvPicPr/>
+                  </pic:nvPicPr>
+                  <pic:blipFill>
+                    <a:blip xmlns:r="http://schemas.openxmlformats.org/officeDocument/2006/relationships" r:embed="rId9"/>
+                    <a:stretch>
+                      <a:fillRect/>
+                    </a:stretch>
+                  </pic:blipFill>
+                  <pic:spPr>
+                    <a:xfrm>
+                      <a:off x="0" y="0"/>
+                      <a:ext cx="5943600" cy="2709582"/>
+                    </a:xfrm>
+                    <a:prstGeom prst="rect">
+                      <a:avLst/>
+                    </a:prstGeom>
+                  </pic:spPr>
+                </pic:pic>
+              </a:graphicData>
+            </a:graphic>
+          </wp:inline>
+        </w:drawing>
+      </w:r>
+    </w:p>
+    <w:p>
+      <w:pPr>
+        <w:spacing w:before="40" w:after="200"/>
+      </w:pPr>
+      <w:r>
+        <w:rPr>
+          <w:rFonts w:ascii="Arial" w:cs="Arial" w:hAnsi="Arial"/>
+          <w:i/>
+          <w:iCs/>
+          <w:color w:val="666666"/>
+          <w:sz w:val="20"/>
+          <w:szCs w:val="20"/>
+        </w:rPr>
+        <w:t xml:space="preserve">Figure 3: Real-time search filtering by "routing" — 3 grounded claims (AFFECTS and COMMENTED_ON) with exact evidence excerpts and timestamps.</w:t>
       </w:r>
     </w:p>
     <w:p>

</xml_diff>